<commit_message>
Toán 12 Bài 3 hoà nhập: bổ sung điều chỉnh cho HS khuyết tật nhìn (lớp 12A2, 12A7)
Co-Authored-By: Claude Opus 5.5 <noreply@anthropic.com>
</commit_message>
<xml_diff>
--- a/mon/toan/khbd/lop12/KHBD_TOAN12_Bai3_DuongTiemCan_T10-13_HoaNhap.docx
+++ b/mon/toan/khbd/lop12/KHBD_TOAN12_Bai3_DuongTiemCan_T10-13_HoaNhap.docx
@@ -122,7 +122,7 @@
           <w:color w:val="C00000"/>
           <w:sz w:val="26"/>
         </w:rPr>
-        <w:t>(KHBD hoà nhập dùng chung. Phạm vi áp dụng: Lớp 12A3, 12A5, 12A7: 01 HS khuyết tật vận động (nặng) · Các lớp khác: dạy theo phần chung, bỏ qua phần điều chỉnh HSKT.)</w:t>
+        <w:t>(KHBD hoà nhập dùng chung. Phạm vi áp dụng: Lớp 12A3, 12A5: 01 HS khuyết tật vận động (nặng) · Lớp 12A7: 01 HS khuyết tật vận động (nặng), 01 HS khuyết tật nhìn (nặng) · Lớp 12A2: 01 HS khuyết tật nhìn (nặng) · Các lớp khác: dạy theo phần chung, bỏ qua phần điều chỉnh HSKT.)</w:t>
       </w:r>
     </w:p>
     <w:p>
@@ -804,6 +804,36 @@
           <w:sz w:val="26"/>
         </w:rPr>
         <w:t xml:space="preserve"> (cong vẹo cột sống, đi lại khó khăn; trí tuệ bình thường, hai tay tốt; không ngồi một tư thế hay cúi viết lâu, không lên bảng, không mang vác): Tìm được phương trình các đường tiệm cận của hàm phân thức đơn giản; dùng máy tính cầm tay (CALC với giá trị x rất lớn hoặc rất gần x₀, TABLE) để dự đoán và kiểm tra giới hạn.</w:t>
+      </w:r>
+    </w:p>
+    <w:p>
+      <w:pPr>
+        <w:spacing w:before="0" w:after="60" w:line="264" w:lineRule="auto"/>
+        <w:ind w:left="340" w:hanging="255"/>
+        <w:jc w:val="both"/>
+      </w:pPr>
+      <w:r>
+        <w:rPr>
+          <w:rFonts w:ascii="Times New Roman" w:hAnsi="Times New Roman" w:eastAsia="Times New Roman"/>
+          <w:sz w:val="26"/>
+        </w:rPr>
+        <w:t>-</w:t>
+        <w:tab/>
+      </w:r>
+      <w:r>
+        <w:rPr>
+          <w:rFonts w:ascii="Times New Roman" w:hAnsi="Times New Roman" w:eastAsia="Times New Roman"/>
+          <w:b/>
+          <w:sz w:val="26"/>
+        </w:rPr>
+        <w:t>Khuyết tật nhìn (nặng)</w:t>
+      </w:r>
+      <w:r>
+        <w:rPr>
+          <w:rFonts w:ascii="Times New Roman" w:hAnsi="Times New Roman" w:eastAsia="Times New Roman"/>
+          <w:sz w:val="26"/>
+        </w:rPr>
+        <w:t xml:space="preserve"> (thị lực kém; nghe hiểu, tính nhẩm tốt; không đọc được chữ cỡ 12 – 13pt, khó nhìn bảng, màn hình, đồ thị nhiều nét, màn hình máy tính cầm tay): Hiểu được ý nghĩa tiệm cận đứng, tiệm cận ngang, tiệm cận xiên qua giới hạn (diễn đạt bằng lời: "x càng lớn thì y càng gần ..."); tìm được tiệm cận của hàm phân thức đơn giản bằng tính giới hạn trên đề in chữ to; miễn nhận dạng tiệm cận qua hình vẽ đồ thị.</w:t>
       </w:r>
     </w:p>
     <w:p>
@@ -1855,6 +1885,36 @@
           <w:sz w:val="26"/>
         </w:rPr>
         <w:t xml:space="preserve"> Phiếu học tập in sẵn đề HĐ, ví dụ, luyện tập và bảng tóm tắt cách tìm 3 loại tiệm cận (đặt trên giá đỡ sách); hình đồ thị in sẵn cho các bài nhận dạng tiệm cận. Đệm tựa lưng, giá đỡ sách; bàn đầu sát lối đi, gần cửa.</w:t>
+      </w:r>
+    </w:p>
+    <w:p>
+      <w:pPr>
+        <w:spacing w:before="0" w:after="60" w:line="264" w:lineRule="auto"/>
+        <w:ind w:left="340" w:hanging="255"/>
+        <w:jc w:val="both"/>
+      </w:pPr>
+      <w:r>
+        <w:rPr>
+          <w:rFonts w:ascii="Times New Roman" w:hAnsi="Times New Roman" w:eastAsia="Times New Roman"/>
+          <w:sz w:val="26"/>
+        </w:rPr>
+        <w:t>-</w:t>
+        <w:tab/>
+      </w:r>
+      <w:r>
+        <w:rPr>
+          <w:rFonts w:ascii="Times New Roman" w:hAnsi="Times New Roman" w:eastAsia="Times New Roman"/>
+          <w:b/>
+          <w:sz w:val="26"/>
+        </w:rPr>
+        <w:t>Khuyết tật nhìn (nặng):</w:t>
+      </w:r>
+      <w:r>
+        <w:rPr>
+          <w:rFonts w:ascii="Times New Roman" w:hAnsi="Times New Roman" w:eastAsia="Times New Roman"/>
+          <w:sz w:val="26"/>
+        </w:rPr>
+        <w:t xml:space="preserve"> Phiếu chữ to giấy trắng ngà, kính lúp, đèn bàn; máy tính cầm tay dán chấm nổi phím 5 và =; bàn đầu chính diện bảng.</w:t>
       </w:r>
     </w:p>
     <w:p>
@@ -3363,7 +3423,7 @@
           <w:color w:val="1F3864"/>
           <w:sz w:val="26"/>
         </w:rPr>
-        <w:t xml:space="preserve"> (Ma trận – dòng HĐ1): KT vận động: HS nêu dự đoán tại chỗ; GV đưa tình huống in sẵn, không yêu cầu chép đề.</w:t>
+        <w:t xml:space="preserve"> (Ma trận – dòng HĐ1): KT vận động: HS nêu dự đoán tại chỗ; GV đưa tình huống in sẵn, không yêu cầu chép đề. · KT nhìn: GV đọc to tình huống mở đầu, mô tả bằng lời hình dạng đồ thị ("đường cong càng ra xa càng sát đường thẳng ..."); HS nêu dự đoán miệng tại chỗ.</w:t>
       </w:r>
     </w:p>
     <w:p>
@@ -12375,7 +12435,50 @@
           <w:color w:val="1F3864"/>
           <w:sz w:val="26"/>
         </w:rPr>
-        <w:t xml:space="preserve"> (Ma trận – dòng HĐ2): KT vận động: HS dùng phiếu in sẵn đề, chỉ ghi các bước chính; hướng dẫn HS dùng máy tính cầm tay tính giới hạn (CALC với x = 10⁶, x = x₀ ± 0,001) để rút ngắn lời giải, dành thời gian tựa lưng nghỉ; trả lời tại chỗ, GV chiếu vở qua điện thoại. Hoạt động kéo dài 3 tiết nên cho HS vươn vai tại chỗ 2 – 3 phút sau mỗi 20 phút.</w:t>
+        <w:t xml:space="preserve"> (Ma trận – dòng HĐ2): KT vận động: HS dùng phiếu in sẵn đề, chỉ ghi các bước chính; hướng dẫn HS dùng máy tính cầm tay tính giới hạn (CALC với x = 10⁶, x = x₀ ± 0,001) để rút ngắn lời giải, dành thời gian tựa lưng nghỉ; trả lời tại chỗ, GV chiếu vở qua điện thoại. Hoạt động kéo dài 3 tiết nên cho HS vươn vai tại chỗ 2 – 3 phút sau mỗi 20 phút. · KT nhìn: Phiếu in chữ to (Arial 20 – 22pt) định nghĩa, HĐ, ví dụ; GV vừa viết vừa đọc to biểu thức, chiều giới hạn (</w:t>
+      </w:r>
+      <m:oMath>
+        <m:r>
+          <m:t>x→+∞</m:t>
+        </m:r>
+      </m:oMath>
+      <w:r>
+        <w:rPr>
+          <w:rFonts w:ascii="Times New Roman" w:hAnsi="Times New Roman" w:eastAsia="Times New Roman"/>
+          <w:color w:val="1F3864"/>
+          <w:sz w:val="26"/>
+        </w:rPr>
+        <w:t xml:space="preserve">, </w:t>
+      </w:r>
+      <m:oMath>
+        <m:r>
+          <m:t>x→</m:t>
+        </m:r>
+        <m:sSubSup>
+          <m:e>
+            <m:r>
+              <m:t>x</m:t>
+            </m:r>
+          </m:e>
+          <m:sub>
+            <m:r>
+              <m:t>0</m:t>
+            </m:r>
+          </m:sub>
+          <m:sup>
+            <m:r>
+              <m:t>+</m:t>
+            </m:r>
+          </m:sup>
+        </m:sSubSup>
+      </m:oMath>
+      <w:r>
+        <w:rPr>
+          <w:rFonts w:ascii="Times New Roman" w:hAnsi="Times New Roman" w:eastAsia="Times New Roman"/>
+          <w:color w:val="1F3864"/>
+          <w:sz w:val="26"/>
+        </w:rPr>
+        <w:t>); HS dùng máy tính cầm tay (bạn cùng bàn đọc kết quả CALC, TABLE) để dự đoán giới hạn; ví dụ nhận dạng tiệm cận qua đồ thị được chuyển sang dạng cho sẵn giới hạn bằng lời; dùng que, dây thép uốn làm mô hình sờ (nếu có); nghỉ mắt 1 – 2 phút sau mỗi 15 – 20 phút.</w:t>
       </w:r>
     </w:p>
     <w:p>
@@ -13867,7 +13970,7 @@
           <w:color w:val="1F3864"/>
           <w:sz w:val="26"/>
         </w:rPr>
-        <w:t xml:space="preserve"> (Ma trận – dòng HĐ3): KT vận động: HS làm Mức 1 – Mức 2 của phiếu phân hoá trên phiếu in sẵn đề; Trạm kiểm chứng AI: nhóm lấy bàn HSKT làm bàn trung tâm, HS làm thư kí đối chiếu. GV chấm tại bàn, không gọi lên bảng.</w:t>
+        <w:t xml:space="preserve"> (Ma trận – dòng HĐ3): KT vận động: HS làm Mức 1 – Mức 2 của phiếu phân hoá trên phiếu in sẵn đề; Trạm kiểm chứng AI: nhóm lấy bàn HSKT làm bàn trung tâm, HS làm thư kí đối chiếu. GV chấm tại bàn, không gọi lên bảng. · KT nhìn: Bài tập phân hoá in chữ to, chỉ chọn câu cho bằng công thức (bỏ câu nhìn đồ thị, bảng biến thiên hoặc đọc bảng biến thiên bằng lời); kiểm tra vấn đáp tại chỗ; Trạm kiểm chứng AI: bạn đọc to lời giải AI, HS chỉ ra lỗi bằng lời.</w:t>
       </w:r>
     </w:p>
     <w:p>
@@ -15002,7 +15105,7 @@
           <w:color w:val="1F3864"/>
           <w:sz w:val="26"/>
         </w:rPr>
-        <w:t xml:space="preserve"> (Ma trận – dòng HĐ4): KT vận động: HS nhận phần việc tính toán, vẽ đồ thị GeoGebra trên điện thoại tại bàn; nộp sản phẩm qua Classroom/Padlet.</w:t>
+        <w:t xml:space="preserve"> (Ma trận – dòng HĐ4): KT vận động: HS nhận phần việc tính toán, vẽ đồ thị GeoGebra trên điện thoại tại bàn; nộp sản phẩm qua Classroom/Padlet. · KT nhìn: HS phụ trách phần tính giới hạn, lập luận và trình bày miệng của nhóm; bạn mô tả đồ thị GeoGebra.</w:t>
       </w:r>
     </w:p>
     <w:p>
@@ -15213,7 +15316,7 @@
           <w:color w:val="1F3864"/>
           <w:sz w:val="26"/>
         </w:rPr>
-        <w:t xml:space="preserve"> (Ma trận – dòng Củng cố): KT vận động: HS làm trắc nghiệm tại chỗ trên điện thoại; cho thêm 3 – 5 phút hoặc hoàn thành ở nhà nếu mệt.</w:t>
+        <w:t xml:space="preserve"> (Ma trận – dòng Củng cố): KT vận động: HS làm trắc nghiệm tại chỗ trên điện thoại; cho thêm 3 – 5 phút hoặc hoàn thành ở nhà nếu mệt. · KT nhìn: HS phóng to bài trắc nghiệm trên điện thoại hoặc bạn cùng bàn đọc đề; cho thêm thời gian hoặc vấn đáp với GV.</w:t>
       </w:r>
     </w:p>
     <w:p>
@@ -21384,6 +21487,36 @@
           <w:sz w:val="26"/>
         </w:rPr>
         <w:t xml:space="preserve"> Chấp nhận lời giải ngắn gọn, các bước bấm máy tính cầm tay ra kết quả đúng ở phép tính phức tạp; không đánh giá phần trình bày bảng. Kiểm tra định kì: +15 – 20 phút, phòng tầng 1.</w:t>
+      </w:r>
+    </w:p>
+    <w:p>
+      <w:pPr>
+        <w:spacing w:before="0" w:after="60" w:line="264" w:lineRule="auto"/>
+        <w:ind w:left="340" w:hanging="255"/>
+        <w:jc w:val="both"/>
+      </w:pPr>
+      <w:r>
+        <w:rPr>
+          <w:rFonts w:ascii="Times New Roman" w:hAnsi="Times New Roman" w:eastAsia="Times New Roman"/>
+          <w:sz w:val="26"/>
+        </w:rPr>
+        <w:t>-</w:t>
+        <w:tab/>
+      </w:r>
+      <w:r>
+        <w:rPr>
+          <w:rFonts w:ascii="Times New Roman" w:hAnsi="Times New Roman" w:eastAsia="Times New Roman"/>
+          <w:b/>
+          <w:sz w:val="26"/>
+        </w:rPr>
+        <w:t>Khuyết tật nhìn (nặng):</w:t>
+      </w:r>
+      <w:r>
+        <w:rPr>
+          <w:rFonts w:ascii="Times New Roman" w:hAnsi="Times New Roman" w:eastAsia="Times New Roman"/>
+          <w:sz w:val="26"/>
+        </w:rPr>
+        <w:t xml:space="preserve"> ưu tiên vấn đáp tại chỗ; phiếu và đề in chữ to 20 – 22pt, lược bỏ câu buộc phải nhìn đồ thị, hình vẽ (thay bằng câu đại số tương đương); HS khoanh trực tiếp trên đề (miễn tô phiếu trắc nghiệm ô nhỏ) hoặc có người đọc đề, ghi hộ đáp án; kiểm tra định kì cộng thêm 20 – 30 phút. Bài củng cố online: HS phóng to trên điện thoại hoặc bạn cùng bàn đọc đề, HS chọn đáp án; có thể làm vấn đáp với GV thay thế.</w:t>
       </w:r>
     </w:p>
     <w:p>
@@ -24927,8 +25060,9 @@
         </w:tblBorders>
       </w:tblPr>
       <w:tblGrid>
-        <w:gridCol w:w="5102"/>
-        <w:gridCol w:w="5102"/>
+        <w:gridCol w:w="3401"/>
+        <w:gridCol w:w="3401"/>
+        <w:gridCol w:w="3401"/>
       </w:tblGrid>
       <w:tr>
         <w:tc>
@@ -24954,7 +25088,7 @@
         </w:tc>
         <w:tc>
           <w:tcPr>
-            <w:tcW w:type="dxa" w:w="8277"/>
+            <w:tcW w:type="dxa" w:w="4139"/>
             <w:shd w:val="clear" w:color="auto" w:fill="DCE6F2"/>
             <w:vAlign w:val="center"/>
           </w:tcPr>
@@ -24970,6 +25104,27 @@
                 <w:sz w:val="22"/>
               </w:rPr>
               <w:t>Khuyết tật vận động (nặng)</w:t>
+            </w:r>
+          </w:p>
+        </w:tc>
+        <w:tc>
+          <w:tcPr>
+            <w:tcW w:type="dxa" w:w="4139"/>
+            <w:shd w:val="clear" w:color="auto" w:fill="DCE6F2"/>
+            <w:vAlign w:val="center"/>
+          </w:tcPr>
+          <w:p>
+            <w:pPr>
+              <w:spacing w:before="0" w:after="20" w:line="264" w:lineRule="auto"/>
+              <w:jc w:val="center"/>
+            </w:pPr>
+            <w:r>
+              <w:rPr>
+                <w:rFonts w:ascii="Times New Roman" w:hAnsi="Times New Roman" w:eastAsia="Times New Roman"/>
+                <w:b/>
+                <w:sz w:val="22"/>
+              </w:rPr>
+              <w:t>Khuyết tật nhìn (nặng)</w:t>
             </w:r>
           </w:p>
         </w:tc>
@@ -24996,7 +25151,7 @@
         </w:tc>
         <w:tc>
           <w:tcPr>
-            <w:tcW w:type="dxa" w:w="8277"/>
+            <w:tcW w:type="dxa" w:w="4139"/>
             <w:vAlign w:val="center"/>
           </w:tcPr>
           <w:p>
@@ -25010,6 +25165,25 @@
                 <w:sz w:val="22"/>
               </w:rPr>
               <w:t>HS nêu dự đoán tại chỗ; GV đưa tình huống in sẵn, không yêu cầu chép đề.</w:t>
+            </w:r>
+          </w:p>
+        </w:tc>
+        <w:tc>
+          <w:tcPr>
+            <w:tcW w:type="dxa" w:w="4139"/>
+            <w:vAlign w:val="center"/>
+          </w:tcPr>
+          <w:p>
+            <w:pPr>
+              <w:spacing w:before="0" w:after="20" w:line="264" w:lineRule="auto"/>
+              <w:jc w:val="left"/>
+            </w:pPr>
+            <w:r>
+              <w:rPr>
+                <w:rFonts w:ascii="Times New Roman" w:hAnsi="Times New Roman" w:eastAsia="Times New Roman"/>
+                <w:sz w:val="22"/>
+              </w:rPr>
+              <w:t>GV đọc to tình huống mở đầu, mô tả bằng lời hình dạng đồ thị ("đường cong càng ra xa càng sát đường thẳng ..."); HS nêu dự đoán miệng tại chỗ.</w:t>
             </w:r>
           </w:p>
         </w:tc>
@@ -25036,7 +25210,7 @@
         </w:tc>
         <w:tc>
           <w:tcPr>
-            <w:tcW w:type="dxa" w:w="8277"/>
+            <w:tcW w:type="dxa" w:w="4139"/>
             <w:vAlign w:val="center"/>
           </w:tcPr>
           <w:p>
@@ -25050,6 +25224,66 @@
                 <w:sz w:val="22"/>
               </w:rPr>
               <w:t>HS dùng phiếu in sẵn đề, chỉ ghi các bước chính; hướng dẫn HS dùng máy tính cầm tay tính giới hạn (CALC với x = 10⁶, x = x₀ ± 0,001) để rút ngắn lời giải, dành thời gian tựa lưng nghỉ; trả lời tại chỗ, GV chiếu vở qua điện thoại. Hoạt động kéo dài 3 tiết nên cho HS vươn vai tại chỗ 2 – 3 phút sau mỗi 20 phút.</w:t>
+            </w:r>
+          </w:p>
+        </w:tc>
+        <w:tc>
+          <w:tcPr>
+            <w:tcW w:type="dxa" w:w="4139"/>
+            <w:vAlign w:val="center"/>
+          </w:tcPr>
+          <w:p>
+            <w:pPr>
+              <w:spacing w:before="0" w:after="20" w:line="264" w:lineRule="auto"/>
+              <w:jc w:val="left"/>
+            </w:pPr>
+            <w:r>
+              <w:rPr>
+                <w:rFonts w:ascii="Times New Roman" w:hAnsi="Times New Roman" w:eastAsia="Times New Roman"/>
+                <w:sz w:val="22"/>
+              </w:rPr>
+              <w:t>Phiếu in chữ to (Arial 20 – 22pt) định nghĩa, HĐ, ví dụ; GV vừa viết vừa đọc to biểu thức, chiều giới hạn (</w:t>
+            </w:r>
+            <m:oMath>
+              <m:r>
+                <m:t>x→+∞</m:t>
+              </m:r>
+            </m:oMath>
+            <w:r>
+              <w:rPr>
+                <w:rFonts w:ascii="Times New Roman" w:hAnsi="Times New Roman" w:eastAsia="Times New Roman"/>
+                <w:sz w:val="22"/>
+              </w:rPr>
+              <w:t xml:space="preserve">, </w:t>
+            </w:r>
+            <m:oMath>
+              <m:r>
+                <m:t>x→</m:t>
+              </m:r>
+              <m:sSubSup>
+                <m:e>
+                  <m:r>
+                    <m:t>x</m:t>
+                  </m:r>
+                </m:e>
+                <m:sub>
+                  <m:r>
+                    <m:t>0</m:t>
+                  </m:r>
+                </m:sub>
+                <m:sup>
+                  <m:r>
+                    <m:t>+</m:t>
+                  </m:r>
+                </m:sup>
+              </m:sSubSup>
+            </m:oMath>
+            <w:r>
+              <w:rPr>
+                <w:rFonts w:ascii="Times New Roman" w:hAnsi="Times New Roman" w:eastAsia="Times New Roman"/>
+                <w:sz w:val="22"/>
+              </w:rPr>
+              <w:t>); HS dùng máy tính cầm tay (bạn cùng bàn đọc kết quả CALC, TABLE) để dự đoán giới hạn; ví dụ nhận dạng tiệm cận qua đồ thị được chuyển sang dạng cho sẵn giới hạn bằng lời; dùng que, dây thép uốn làm mô hình sờ (nếu có); nghỉ mắt 1 – 2 phút sau mỗi 15 – 20 phút.</w:t>
             </w:r>
           </w:p>
         </w:tc>
@@ -25076,7 +25310,7 @@
         </w:tc>
         <w:tc>
           <w:tcPr>
-            <w:tcW w:type="dxa" w:w="8277"/>
+            <w:tcW w:type="dxa" w:w="4139"/>
             <w:vAlign w:val="center"/>
           </w:tcPr>
           <w:p>
@@ -25090,6 +25324,25 @@
                 <w:sz w:val="22"/>
               </w:rPr>
               <w:t>HS làm Mức 1 – Mức 2 của phiếu phân hoá trên phiếu in sẵn đề; Trạm kiểm chứng AI: nhóm lấy bàn HSKT làm bàn trung tâm, HS làm thư kí đối chiếu. GV chấm tại bàn, không gọi lên bảng.</w:t>
+            </w:r>
+          </w:p>
+        </w:tc>
+        <w:tc>
+          <w:tcPr>
+            <w:tcW w:type="dxa" w:w="4139"/>
+            <w:vAlign w:val="center"/>
+          </w:tcPr>
+          <w:p>
+            <w:pPr>
+              <w:spacing w:before="0" w:after="20" w:line="264" w:lineRule="auto"/>
+              <w:jc w:val="left"/>
+            </w:pPr>
+            <w:r>
+              <w:rPr>
+                <w:rFonts w:ascii="Times New Roman" w:hAnsi="Times New Roman" w:eastAsia="Times New Roman"/>
+                <w:sz w:val="22"/>
+              </w:rPr>
+              <w:t>Bài tập phân hoá in chữ to, chỉ chọn câu cho bằng công thức (bỏ câu nhìn đồ thị, bảng biến thiên hoặc đọc bảng biến thiên bằng lời); kiểm tra vấn đáp tại chỗ; Trạm kiểm chứng AI: bạn đọc to lời giải AI, HS chỉ ra lỗi bằng lời.</w:t>
             </w:r>
           </w:p>
         </w:tc>
@@ -25116,7 +25369,7 @@
         </w:tc>
         <w:tc>
           <w:tcPr>
-            <w:tcW w:type="dxa" w:w="8277"/>
+            <w:tcW w:type="dxa" w:w="4139"/>
             <w:vAlign w:val="center"/>
           </w:tcPr>
           <w:p>
@@ -25130,6 +25383,25 @@
                 <w:sz w:val="22"/>
               </w:rPr>
               <w:t>HS nhận phần việc tính toán, vẽ đồ thị GeoGebra trên điện thoại tại bàn; nộp sản phẩm qua Classroom/Padlet.</w:t>
+            </w:r>
+          </w:p>
+        </w:tc>
+        <w:tc>
+          <w:tcPr>
+            <w:tcW w:type="dxa" w:w="4139"/>
+            <w:vAlign w:val="center"/>
+          </w:tcPr>
+          <w:p>
+            <w:pPr>
+              <w:spacing w:before="0" w:after="20" w:line="264" w:lineRule="auto"/>
+              <w:jc w:val="left"/>
+            </w:pPr>
+            <w:r>
+              <w:rPr>
+                <w:rFonts w:ascii="Times New Roman" w:hAnsi="Times New Roman" w:eastAsia="Times New Roman"/>
+                <w:sz w:val="22"/>
+              </w:rPr>
+              <w:t>HS phụ trách phần tính giới hạn, lập luận và trình bày miệng của nhóm; bạn mô tả đồ thị GeoGebra.</w:t>
             </w:r>
           </w:p>
         </w:tc>
@@ -25156,7 +25428,7 @@
         </w:tc>
         <w:tc>
           <w:tcPr>
-            <w:tcW w:type="dxa" w:w="8277"/>
+            <w:tcW w:type="dxa" w:w="4139"/>
             <w:vAlign w:val="center"/>
           </w:tcPr>
           <w:p>
@@ -25170,6 +25442,25 @@
                 <w:sz w:val="22"/>
               </w:rPr>
               <w:t>HS làm trắc nghiệm tại chỗ trên điện thoại; cho thêm 3 – 5 phút hoặc hoàn thành ở nhà nếu mệt.</w:t>
+            </w:r>
+          </w:p>
+        </w:tc>
+        <w:tc>
+          <w:tcPr>
+            <w:tcW w:type="dxa" w:w="4139"/>
+            <w:vAlign w:val="center"/>
+          </w:tcPr>
+          <w:p>
+            <w:pPr>
+              <w:spacing w:before="0" w:after="20" w:line="264" w:lineRule="auto"/>
+              <w:jc w:val="left"/>
+            </w:pPr>
+            <w:r>
+              <w:rPr>
+                <w:rFonts w:ascii="Times New Roman" w:hAnsi="Times New Roman" w:eastAsia="Times New Roman"/>
+                <w:sz w:val="22"/>
+              </w:rPr>
+              <w:t>HS phóng to bài trắc nghiệm trên điện thoại hoặc bạn cùng bàn đọc đề; cho thêm thời gian hoặc vấn đáp với GV.</w:t>
             </w:r>
           </w:p>
         </w:tc>
@@ -25196,7 +25487,7 @@
         </w:tc>
         <w:tc>
           <w:tcPr>
-            <w:tcW w:type="dxa" w:w="8277"/>
+            <w:tcW w:type="dxa" w:w="4139"/>
             <w:vAlign w:val="center"/>
           </w:tcPr>
           <w:p>
@@ -25210,6 +25501,25 @@
                 <w:sz w:val="22"/>
               </w:rPr>
               <w:t>Chấp nhận lời giải ngắn gọn, các bước bấm máy tính cầm tay ra kết quả đúng ở phép tính phức tạp; không đánh giá phần trình bày bảng. Kiểm tra định kì: +15 – 20 phút, phòng tầng 1.</w:t>
+            </w:r>
+          </w:p>
+        </w:tc>
+        <w:tc>
+          <w:tcPr>
+            <w:tcW w:type="dxa" w:w="4139"/>
+            <w:vAlign w:val="center"/>
+          </w:tcPr>
+          <w:p>
+            <w:pPr>
+              <w:spacing w:before="0" w:after="20" w:line="264" w:lineRule="auto"/>
+              <w:jc w:val="left"/>
+            </w:pPr>
+            <w:r>
+              <w:rPr>
+                <w:rFonts w:ascii="Times New Roman" w:hAnsi="Times New Roman" w:eastAsia="Times New Roman"/>
+                <w:sz w:val="22"/>
+              </w:rPr>
+              <w:t>ưu tiên vấn đáp tại chỗ; phiếu và đề in chữ to 20 – 22pt, lược bỏ câu buộc phải nhìn đồ thị, hình vẽ (thay bằng câu đại số tương đương); HS khoanh trực tiếp trên đề (miễn tô phiếu trắc nghiệm ô nhỏ) hoặc có người đọc đề, ghi hộ đáp án; kiểm tra định kì cộng thêm 20 – 30 phút. Bài củng cố online: HS phóng to trên điện thoại hoặc bạn cùng bàn đọc đề, HS chọn đáp án; có thể làm vấn đáp với GV thay thế.</w:t>
             </w:r>
           </w:p>
         </w:tc>

</xml_diff>